<commit_message>
Modelos: habitación actualizada, carta de preaviso y recibo de alquiler
</commit_message>
<xml_diff>
--- a/modelos/contrato-alquiler-habitacion.docx
+++ b/modelos/contrato-alquiler-habitacion.docx
@@ -12,6 +12,52 @@
           <w:sz w:val="28"/>
         </w:rPr>
         <w:t>Modelo de contrato de alquiler de habitación (2026)</w:t>
+      </w:r>
+    </w:p>
+    <w:p>
+      <w:pPr>
+        <w:jc w:val="center"/>
+      </w:pPr>
+      <w:r>
+        <w:rPr>
+          <w:b/>
+          <w:sz w:val="24"/>
+        </w:rPr>
+        <w:t>Alquiler de habitación: Código Civil y diferencias con la LAU</w:t>
+      </w:r>
+    </w:p>
+    <w:p>
+      <w:pPr>
+        <w:jc w:val="both"/>
+      </w:pPr>
+      <w:r>
+        <w:t xml:space="preserve">Esta plantilla se plantea como arrendamiento de una habitación bajo el </w:t>
+      </w:r>
+      <w:r>
+        <w:rPr>
+          <w:b/>
+        </w:rPr>
+        <w:t>Código Civil</w:t>
+      </w:r>
+      <w:r>
+        <w:t>: uso de una parte identificada del inmueble por un precio y un tiempo pactados (artículo 1543), con pactos dentro de los límites del artículo 1255. En ese régimen, duración, salida anticipada y garantía se concretan en el contrato; no se trasladan automáticamente las prórrogas de cinco o siete años ni el desistimiento del artículo 11 de la LAU de vivienda habitual. Las obligaciones de conservación y uso se apoyan en los artículos 1554 y 1555 del Código Civil.</w:t>
+      </w:r>
+    </w:p>
+    <w:p>
+      <w:pPr>
+        <w:jc w:val="both"/>
+      </w:pPr>
+      <w:r>
+        <w:t xml:space="preserve">El BOE no establece una exclusión universal de toda habitación de la LAU: </w:t>
+      </w:r>
+      <w:r>
+        <w:rPr>
+          <w:b/>
+        </w:rPr>
+        <w:t>esta es una plantilla para los casos en que procede el régimen civil</w:t>
+      </w:r>
+      <w:r>
+        <w:t>, no una forma de elegir la ley a voluntad. Si el uso y las circunstancias encajan en la protección imperativa de vivienda, habrá que adaptarla.</w:t>
       </w:r>
     </w:p>
     <w:p>
@@ -97,6 +143,20 @@
       </w:r>
       <w:r>
         <w:t xml:space="preserve"> [nombre, documento y domicilio de notificaciones]. Ambas partes se reconocen capacidad y acuerdan:</w:t>
+      </w:r>
+    </w:p>
+    <w:p>
+      <w:pPr>
+        <w:jc w:val="both"/>
+      </w:pPr>
+      <w:r>
+        <w:rPr>
+          <w:b/>
+        </w:rPr>
+        <w:t>0. Régimen.</w:t>
+      </w:r>
+      <w:r>
+        <w:t xml:space="preserve"> Las partes documentan un arrendamiento civil de habitación, sujeto al Código Civil y a los pactos siguientes, sin excluir normas imperativas que legalmente resulten aplicables.</w:t>
       </w:r>
     </w:p>
     <w:p>
@@ -287,7 +347,27 @@
         <w:t>Fuentes:</w:t>
       </w:r>
       <w:r>
-        <w:t xml:space="preserve"> LAU, artículos 2, 3, 6 y 8 (https://www.boe.es/buscar/act.php?id=BOE-A-1994-26003), Código Civil, arrendamiento (https://www.boe.es/buscar/act.php?id=BOE-A-1889-4763#art1543), consultadas el 5 de octubre de 2026. No es asesoramiento jurídico. Completa el inventario (https://cirameva.com/modelos/inventario-piso-alquilado/).</w:t>
+        <w:t xml:space="preserve"> LAU, artículos 2, 3, 6 y 8 (https://www.boe.es/buscar/act.php?id=BOE-A-1994-26003), Código Civil, artículos 1255, 1543, 1554 y 1555 (https://www.boe.es/buscar/act.php?id=BOE-A-1889-4763#art1543), consultadas el 5 de octubre de 2026. No es asesoramiento jurídico. Completa el inventario (https://cirameva.com/modelos/inventario-piso-alquilado/).</w:t>
+      </w:r>
+    </w:p>
+    <w:p>
+      <w:pPr>
+        <w:jc w:val="center"/>
+      </w:pPr>
+      <w:r>
+        <w:rPr>
+          <w:b/>
+          <w:sz w:val="24"/>
+        </w:rPr>
+        <w:t>Revisión normativa de octubre de 2026</w:t>
+      </w:r>
+    </w:p>
+    <w:p>
+      <w:pPr>
+        <w:jc w:val="both"/>
+      </w:pPr>
+      <w:r>
+        <w:t>LAU consolidada consultada el 5 de octubre de 2026, actualización publicada el 02/10/2026. Los RDL 26/2026 y 27/2026 fueron derogados: resolución BOE-A-2026-20526 (https://www.boe.es/diario_boe/txt.php?id=BOE-A-2026-20526) y resolución BOE-A-2026-20527 (https://www.boe.es/diario_boe/txt.php?id=BOE-A-2026-20527). No se emplean sus reformas como derecho vigente; para contratos firmados durante el 1-2 de octubre revisa el régimen temporal antes de usar el modelo.</w:t>
       </w:r>
     </w:p>
     <w:p>

</xml_diff>